<commit_message>
Rename FinExpert → MARA, add dark/light mode, ES/EN i18n, input validation
- Rename project to MARA (Monitor y Asesor de Finanzas Personales y Ahorro)
- Add dark/light mode toggle with theme.js and CSS custom properties
- Add ES/EN internationalization via i18n.js with ~80 translation keys
- Add controls bar UI (floating pill: language toggle + theme toggle)
- Add frontend input validation per wizard step (ranges, types)
- Add backend validation via validators.py called from app.py (HTTP 400)
- Remove empty files: __init__.py, diagnosis.py, pages/, docs/, fixtures/
- Update .gitignore, Arquitectura.txt and Proyecto_SBC.docx (AVANCES section)
- Add .gitignore at repo root

Co-Authored-By: Claude Sonnet 4.6 <noreply@anthropic.com>
</commit_message>
<xml_diff>
--- a/architecture/Proyecto_SBC.docx
+++ b/architecture/Proyecto_SBC.docx
@@ -435,7 +435,7 @@
           <w:szCs w:val="28"/>
           <w:rtl w:val="0"/>
         </w:rPr>
-        <w:t xml:space="preserve">FinExpert: Sistema Basado en Conocimiento</w:t>
+        <w:t>MARA: Monitor y Asesor de Finanzas Personales y Ahorro</w:t>
       </w:r>
       <w:r>
         <w:rPr>
@@ -1081,7 +1081,7 @@
           <w:u w:val="single"/>
           <w:rtl w:val="0"/>
         </w:rPr>
-        <w:t xml:space="preserve">FinExpert: Sistema Experto para el Diagnóstico y Recomendación en Finanzas Personales</w:t>
+        <w:t>MARA: Monitor y Asesor de Finanzas Personales y Ahorro</w:t>
       </w:r>
       <w:r>
         <w:rPr>
@@ -1099,7 +1099,7 @@
         <w:rPr>
           <w:rtl w:val="0"/>
         </w:rPr>
-        <w:t xml:space="preserve">El nombre </w:t>
+        <w:t>El nombre MARA (Monitor y Asesor de finanzas personales y Ahorro) refleja la esencia del sistema: emular el razonamiento de un asesor financiero profesional para diagnosticar la salud económica del usuario, recomendar estrategias de ahorro, control de deudas e inversión, y pronosticar escenarios futuros con base en sus hábitos y metas personales.</w:t>
       </w:r>
       <w:r>
         <w:rPr>
@@ -1108,13 +1108,11 @@
           <w:color w:val="b01010"/>
           <w:rtl w:val="0"/>
         </w:rPr>
-        <w:t xml:space="preserve">FinExpert</w:t>
-      </w:r>
-      <w:r>
-        <w:rPr>
-          <w:rtl w:val="0"/>
-        </w:rPr>
-        <w:t xml:space="preserve"> conjuga </w:t>
+      </w:r>
+      <w:r>
+        <w:rPr>
+          <w:rtl w:val="0"/>
+        </w:rPr>
       </w:r>
       <w:r>
         <w:rPr>
@@ -1122,13 +1120,11 @@
           <w:iCs w:val="1"/>
           <w:rtl w:val="0"/>
         </w:rPr>
-        <w:t xml:space="preserve">Finance</w:t>
-      </w:r>
-      <w:r>
-        <w:rPr>
-          <w:rtl w:val="0"/>
-        </w:rPr>
-        <w:t xml:space="preserve"> (finanzas) y </w:t>
+      </w:r>
+      <w:r>
+        <w:rPr>
+          <w:rtl w:val="0"/>
+        </w:rPr>
       </w:r>
       <w:r>
         <w:rPr>
@@ -1136,13 +1132,11 @@
           <w:iCs w:val="1"/>
           <w:rtl w:val="0"/>
         </w:rPr>
-        <w:t xml:space="preserve">Expert</w:t>
-      </w:r>
-      <w:r>
-        <w:rPr>
-          <w:rtl w:val="0"/>
-        </w:rPr>
-        <w:t xml:space="preserve"> (experto), reflejando la esencia del sistema: emular el razonamiento de un asesor financiero profesional para </w:t>
+      </w:r>
+      <w:r>
+        <w:rPr>
+          <w:rtl w:val="0"/>
+        </w:rPr>
       </w:r>
       <w:r>
         <w:rPr>
@@ -1150,13 +1144,11 @@
           <w:bCs w:val="1"/>
           <w:rtl w:val="0"/>
         </w:rPr>
-        <w:t xml:space="preserve">diagnosticar</w:t>
-      </w:r>
-      <w:r>
-        <w:rPr>
-          <w:rtl w:val="0"/>
-        </w:rPr>
-        <w:t xml:space="preserve"> la salud económica del usuario, </w:t>
+      </w:r>
+      <w:r>
+        <w:rPr>
+          <w:rtl w:val="0"/>
+        </w:rPr>
       </w:r>
       <w:r>
         <w:rPr>
@@ -1164,13 +1156,11 @@
           <w:bCs w:val="1"/>
           <w:rtl w:val="0"/>
         </w:rPr>
-        <w:t xml:space="preserve">recomendar</w:t>
-      </w:r>
-      <w:r>
-        <w:rPr>
-          <w:rtl w:val="0"/>
-        </w:rPr>
-        <w:t xml:space="preserve"> estrategias de ahorro, control de deudas e inversión, y </w:t>
+      </w:r>
+      <w:r>
+        <w:rPr>
+          <w:rtl w:val="0"/>
+        </w:rPr>
       </w:r>
       <w:r>
         <w:rPr>
@@ -1178,13 +1168,11 @@
           <w:bCs w:val="1"/>
           <w:rtl w:val="0"/>
         </w:rPr>
-        <w:t xml:space="preserve">pronosticar</w:t>
-      </w:r>
-      <w:r>
-        <w:rPr>
-          <w:rtl w:val="0"/>
-        </w:rPr>
-        <w:t xml:space="preserve"> escenarios futuros con base en sus hábitos y metas personales.</w:t>
+      </w:r>
+      <w:r>
+        <w:rPr>
+          <w:rtl w:val="0"/>
+        </w:rPr>
       </w:r>
     </w:p>
     <w:p>
@@ -1223,13 +1211,12 @@
           <w:color w:val="b01010"/>
           <w:rtl w:val="0"/>
         </w:rPr>
-        <w:t xml:space="preserve">¿Qué?  </w:t>
-      </w:r>
-      <w:r>
-        <w:rPr>
-          <w:rtl w:val="0"/>
-        </w:rPr>
-        <w:t xml:space="preserve">Desarrollar FinExpert, un Sistema Basado en Conocimiento capaz de diagnosticar la situación financiera personal de un usuario, recomendar estrategias de ahorro, gestión de deudas e inversión, y pronosticar el comportamiento de sus finanzas a corto y mediano plazo, emulando el razonamiento de un asesor financiero experto.</w:t>
+        <w:t>¿Qué?  Desarrollar MARA, un Sistema Basado en Conocimiento capaz de diagnosticar la situación financiera personal de un usuario, recomendar estrategias de ahorro, gestión de deudas e inversión, y pronosticar el comportamiento de sus finanzas a corto y mediano plazo, emulando el razonamiento de un asesor financiero experto.</w:t>
+      </w:r>
+      <w:r>
+        <w:rPr>
+          <w:rtl w:val="0"/>
+        </w:rPr>
       </w:r>
     </w:p>
     <w:p>
@@ -1377,7 +1364,7 @@
         <w:rPr>
           <w:rtl w:val="0"/>
         </w:rPr>
-        <w:t xml:space="preserve">La justificación del proyecto FinExpert se sustenta en tres pilares fundamentales:</w:t>
+        <w:t>La justificación del proyecto MARA se sustenta en tres pilares fundamentales:</w:t>
       </w:r>
     </w:p>
     <w:p>
@@ -1531,7 +1518,7 @@
           <w:szCs w:val="24"/>
           <w:rtl w:val="0"/>
         </w:rPr>
-        <w:t xml:space="preserve">FinExpert adopta una arquitectura de tres capas clásica de los Sistemas Basados en Conocimiento, donde cada capa tiene responsabilidades claramente delimitadas y se comunica con las demás a través de interfaces definidas. Esta separación garantiza que el conocimiento del dominio pueda modificarse sin afectar la lógica de inferencia, y que la interfaz pueda rediseñarse sin alterar las reglas.</w:t>
+        <w:t>MARA adopta una arquitectura de tres capas clásica de los Sistemas Basados en Conocimiento, donde cada capa tiene responsabilidades claramente delimitadas y se comunica con las demás a través de interfaces definidas. Esta separación garantiza que el conocimiento del dominio pueda modificarse sin afectar la lógica de inferencia, y que la interfaz pueda rediseñarse sin alterar las reglas.</w:t>
       </w:r>
       <w:r>
         <w:rPr>
@@ -6219,7 +6206,7 @@
           <w:szCs w:val="24"/>
           <w:rtl w:val="0"/>
         </w:rPr>
-        <w:t xml:space="preserve">La base de conocimiento de FinExpert constituye el repositorio central del saber experto del sistema. Su construcción siguió un proceso de tres etapas: adquisición, estructuración y validación.</w:t>
+        <w:t>La base de conocimiento de MARA constituye el repositorio central del saber experto del sistema. Su construcción siguió un proceso de tres etapas: adquisición, estructuración y validación.</w:t>
       </w:r>
       <w:r>
         <w:rPr>
@@ -8484,7 +8471,7 @@
           <w:szCs w:val="24"/>
           <w:rtl w:val="0"/>
         </w:rPr>
-        <w:t xml:space="preserve">El motor de inferencia de FinExpert implementa el paradigma de encadenamiento hacia adelante (forward chaining), partiendo de los hechos conocidos del usuario para derivar conclusiones hasta alcanzar el diagnóstico completo. La elección de encadenamiento hacia adelante responde a la naturaleza del problema: el flujo lógico va desde los datos (ingresos, gastos, deudas) hacia el diagnóstico y las recomendaciones, sin partir de una hipótesis previa.</w:t>
+        <w:t>El motor de inferencia de MARA implementa el paradigma de encadenamiento hacia adelante (forward chaining), partiendo de los hechos conocidos del usuario para derivar conclusiones hasta alcanzar el diagnóstico completo. La elección de encadenamiento hacia adelante responde a la naturaleza del problema: el flujo lógico va desde los datos (ingresos, gastos, deudas) hacia el diagnóstico y las recomendaciones, sin partir de una hipótesis previa.</w:t>
       </w:r>
       <w:r>
         <w:rPr>
@@ -8780,7 +8767,7 @@
           <w:szCs w:val="24"/>
           <w:rtl w:val="0"/>
         </w:rPr>
-        <w:t xml:space="preserve">El módulo explicativo es el componente que distingue a FinExpert de una calculadora financiera convencional. Durante cada ciclo de inferencia, el motor registra en una bitácora de trazabilidad el identificador de la regla disparada, los hechos que activaron sus condiciones, la conclusión derivada y el factor de certeza asociado. Cuando el usuario solicita la justificación de una recomendación (botón ¿Por qué?), el módulo recupera la cadena de reglas pertinente y la transforma en una explicación en lenguaje natural, por ejemplo:</w:t>
+        <w:t>El módulo explicativo es el componente que distingue a MARA de una calculadora financiera convencional. Durante cada ciclo de inferencia, el motor registra en una bitácora de trazabilidad el identificador de la regla disparada, los hechos que activaron sus condiciones, la conclusión derivada y el factor de certeza asociado. Cuando el usuario solicita la justificación de una recomendación (botón ¿Por qué?), el módulo recupera la cadena de reglas pertinente y la transforma en una explicación en lenguaje natural, por ejemplo:</w:t>
       </w:r>
       <w:r>
         <w:rPr>
@@ -9082,7 +9069,7 @@
           <w:szCs w:val="24"/>
           <w:rtl w:val="0"/>
         </w:rPr>
-        <w:t xml:space="preserve">La interfaz web de FinExpert sigue el patrón de asistente por pasos (wizard), que guía al usuario desde la captura de datos hasta la presentación de resultados en una secuencia lineal y sin ambigüedades. El diseño prioriza la claridad sobre la complejidad visual, dado que el usuario objetivo puede tener un nivel bajo de educación financiera.</w:t>
+        <w:t>La interfaz web de MARA sigue el patrón de asistente por pasos (wizard), que guía al usuario desde la captura de datos hasta la presentación de resultados en una secuencia lineal y sin ambigüedades. El diseño prioriza la claridad sobre la complejidad visual, dado que el usuario objetivo puede tener un nivel bajo de educación financiera.</w:t>
       </w:r>
       <w:r>
         <w:rPr>
@@ -10026,6 +10013,580 @@
             </a:graphic>
           </wp:anchor>
         </w:drawing>
+      </w:r>
+    </w:p>
+    <w:p>
+      <w:pPr>
+        <w:pStyle w:val="Heading 1"/>
+      </w:pPr>
+      <w:r>
+        <w:rPr/>
+        <w:t xml:space="preserve">AVANCES DEL PROYECTO</w:t>
+      </w:r>
+    </w:p>
+    <w:p>
+      <w:pPr>
+        <w:pStyle w:val="Heading 2"/>
+      </w:pPr>
+      <w:r>
+        <w:rPr/>
+        <w:t xml:space="preserve">Resumen de implementación</w:t>
+      </w:r>
+    </w:p>
+    <w:p>
+      <w:pPr>
+        <w:pStyle w:val="Normal"/>
+      </w:pPr>
+      <w:r>
+        <w:rPr/>
+        <w:t xml:space="preserve">A la fecha de entrega de este informe, el sistema MARA se encuentra completamente implementado y funcional. A continuación se describe el estado de cada componente.</w:t>
+      </w:r>
+    </w:p>
+    <w:p>
+      <w:pPr>
+        <w:pStyle w:val="Heading 2"/>
+      </w:pPr>
+      <w:r>
+        <w:rPr/>
+        <w:t xml:space="preserve">1. Backend — Motor de Inferencia y API REST</w:t>
+      </w:r>
+    </w:p>
+    <w:p>
+      <w:pPr>
+        <w:pStyle w:val="Normal"/>
+      </w:pPr>
+      <w:r>
+        <w:rPr/>
+        <w:t xml:space="preserve">El motor de inferencia RETE simplificado fue desarrollado íntegramente en Python 3.11 sin dependencias de motores externos. Implementa el ciclo Match-Select-Execute con encadenamiento hacia adelante y las siguientes clases principales:</w:t>
+      </w:r>
+    </w:p>
+    <w:p>
+      <w:pPr>
+        <w:pStyle w:val="Normal"/>
+        <w:ind w:left="720"/>
+      </w:pPr>
+      <w:r>
+        <w:rPr/>
+        <w:t xml:space="preserve">• InferenceEngine: orquesta el ciclo completo e invoca al Explainer en cada disparo.</w:t>
+      </w:r>
+    </w:p>
+    <w:p>
+      <w:pPr>
+        <w:pStyle w:val="Normal"/>
+        <w:ind w:left="720"/>
+      </w:pPr>
+      <w:r>
+        <w:rPr/>
+        <w:t xml:space="preserve">• WorkingMemory: almacén mutable de hechos de la sesión activa.</w:t>
+      </w:r>
+    </w:p>
+    <w:p>
+      <w:pPr>
+        <w:pStyle w:val="Normal"/>
+        <w:ind w:left="720"/>
+      </w:pPr>
+      <w:r>
+        <w:rPr/>
+        <w:t xml:space="preserve">• Agenda: evalúa las condiciones IF de todas las reglas y construye el conjunto de conflicto.</w:t>
+      </w:r>
+    </w:p>
+    <w:p>
+      <w:pPr>
+        <w:pStyle w:val="Normal"/>
+        <w:ind w:left="720"/>
+      </w:pPr>
+      <w:r>
+        <w:rPr/>
+        <w:t xml:space="preserve">• ConflictResolver: selecciona la regla a disparar por prioridad → especificidad → factor de certeza.</w:t>
+      </w:r>
+    </w:p>
+    <w:p>
+      <w:pPr>
+        <w:pStyle w:val="Normal"/>
+        <w:ind w:left="720"/>
+      </w:pPr>
+      <w:r>
+        <w:rPr/>
+        <w:t xml:space="preserve">• Explainer: registra la bitácora de trazabilidad y la convierte en lenguaje natural.</w:t>
+      </w:r>
+    </w:p>
+    <w:p>
+      <w:pPr>
+        <w:pStyle w:val="Normal"/>
+      </w:pPr>
+      <w:r>
+        <w:rPr/>
+        <w:t xml:space="preserve">La API REST con Flask expone tres endpoints:</w:t>
+      </w:r>
+    </w:p>
+    <w:p>
+      <w:pPr>
+        <w:pStyle w:val="Normal"/>
+        <w:ind w:left="720"/>
+      </w:pPr>
+      <w:r>
+        <w:rPr/>
+        <w:t xml:space="preserve">• GET  /health  →  verificación de disponibilidad del servicio.</w:t>
+      </w:r>
+    </w:p>
+    <w:p>
+      <w:pPr>
+        <w:pStyle w:val="Normal"/>
+        <w:ind w:left="720"/>
+      </w:pPr>
+      <w:r>
+        <w:rPr/>
+        <w:t xml:space="preserve">• POST /diagnose  →  recibe el perfil del usuario, ejecuta el motor y devuelve diagnóstico completo.</w:t>
+      </w:r>
+    </w:p>
+    <w:p>
+      <w:pPr>
+        <w:pStyle w:val="Normal"/>
+        <w:ind w:left="720"/>
+      </w:pPr>
+      <w:r>
+        <w:rPr/>
+        <w:t xml:space="preserve">• POST /explain  →  devuelve la cadena de razonamiento detallada de una regla específica.</w:t>
+      </w:r>
+    </w:p>
+    <w:p>
+      <w:pPr>
+        <w:pStyle w:val="Normal"/>
+      </w:pPr>
+      <w:r>
+        <w:rPr/>
+        <w:t xml:space="preserve">El módulo validators.py es invocado desde app.py antes de construir el perfil: valida rangos (edad 18-99, tasa 0-200 %, horizonte 1-600 meses) y devuelve HTTP 400 con mensaje descriptivo ante entrada inválida.</w:t>
+      </w:r>
+    </w:p>
+    <w:p>
+      <w:pPr>
+        <w:pStyle w:val="Heading 2"/>
+      </w:pPr>
+      <w:r>
+        <w:rPr/>
+        <w:t xml:space="preserve">2. Base de Conocimiento — 80 Reglas en 6 Dominios</w:t>
+      </w:r>
+    </w:p>
+    <w:p>
+      <w:pPr>
+        <w:pStyle w:val="Normal"/>
+      </w:pPr>
+      <w:r>
+        <w:rPr/>
+        <w:t xml:space="preserve">La base de conocimiento quedó implementada en 6 archivos JSON, uno por dominio. Cada regla tiene los campos: id, dominio, condiciones, conclusion, accion, factor_certeza (0-100) y prioridad (1-10). Los umbrales se basan en CONDUSEF, CNBV, Banxico y ENIF 2021.</w:t>
+      </w:r>
+    </w:p>
+    <w:p>
+      <w:pPr>
+        <w:pStyle w:val="Normal"/>
+        <w:ind w:left="720"/>
+      </w:pPr>
+      <w:r>
+        <w:rPr/>
+        <w:t xml:space="preserve">• diagnostico.json — 20 reglas (D01-D20): determinan la situación financiera principal (critica_extrema, critica, en_riesgo, moderada, saludable) y alertas secundarias (alerta_DAI_alto, alerta_minimo_tarjeta, alerta_tasa_usuraria, etc.).</w:t>
+      </w:r>
+    </w:p>
+    <w:p>
+      <w:pPr>
+        <w:pStyle w:val="Normal"/>
+        <w:ind w:left="720"/>
+      </w:pPr>
+      <w:r>
+        <w:rPr/>
+        <w:t xml:space="preserve">• deuda.json — 15 reglas (DP01-DP15): clasifican el nivel de endeudamiento por DAI y determinan la estrategia de pago (avalancha, bola de nieve, consolidación).</w:t>
+      </w:r>
+    </w:p>
+    <w:p>
+      <w:pPr>
+        <w:pStyle w:val="Normal"/>
+        <w:ind w:left="720"/>
+      </w:pPr>
+      <w:r>
+        <w:rPr/>
+        <w:t xml:space="preserve">• ahorro.json — 15 reglas (AH01-AH15): evalúan el fondo de emergencia, el nivel de ahorro y la urgencia de constituir reservas.</w:t>
+      </w:r>
+    </w:p>
+    <w:p>
+      <w:pPr>
+        <w:pStyle w:val="Normal"/>
+        <w:ind w:left="720"/>
+      </w:pPr>
+      <w:r>
+        <w:rPr/>
+        <w:t xml:space="preserve">• perfil_riesgo.json — 10 reglas (PR01-PR10): clasifican al usuario como agresivo, moderado, conservador o muy_conservador según edad, horizonte y comportamiento.</w:t>
+      </w:r>
+    </w:p>
+    <w:p>
+      <w:pPr>
+        <w:pStyle w:val="Normal"/>
+        <w:ind w:left="720"/>
+      </w:pPr>
+      <w:r>
+        <w:rPr/>
+        <w:t xml:space="preserve">• inversion.json — 10 reglas (IN01-IN10): sugieren instrumentos financieros (CETES, fondos, renta variable, SIC) según perfil de riesgo y capital disponible.</w:t>
+      </w:r>
+    </w:p>
+    <w:p>
+      <w:pPr>
+        <w:pStyle w:val="Normal"/>
+        <w:ind w:left="720"/>
+      </w:pPr>
+      <w:r>
+        <w:rPr/>
+        <w:t xml:space="preserve">• pronostico.json — 10 reglas (FP01-FP10): proyectan el escenario a 6 meses (deterioro, estancamiento, mejora_moderada, mejora_significativa) y emiten alertas de insolvencia.</w:t>
+      </w:r>
+    </w:p>
+    <w:p>
+      <w:pPr>
+        <w:pStyle w:val="Normal"/>
+      </w:pPr>
+      <w:r>
+        <w:rPr/>
+        <w:t xml:space="preserve">Nota de diseño: las reglas usan patrones de exclusión mutua explícita (condición variable != valor) para evitar sobreescritura de conclusiones de mayor prioridad, resolviendo el problema de encadenamiento hacia adelante sin mecanismo de retracción.</w:t>
+      </w:r>
+    </w:p>
+    <w:p>
+      <w:pPr>
+        <w:pStyle w:val="Heading 2"/>
+      </w:pPr>
+      <w:r>
+        <w:rPr/>
+        <w:t xml:space="preserve">3. Frontend — Interfaz Web (SPA)</w:t>
+      </w:r>
+    </w:p>
+    <w:p>
+      <w:pPr>
+        <w:pStyle w:val="Normal"/>
+      </w:pPr>
+      <w:r>
+        <w:rPr/>
+        <w:t xml:space="preserve">La interfaz es una Single Page Application (SPA) desarrollada en HTML5, CSS3 y JavaScript vanilla, sin frameworks adicionales. Se ejecuta directamente en el navegador sin servidor web propio.</w:t>
+      </w:r>
+    </w:p>
+    <w:p>
+      <w:pPr>
+        <w:pStyle w:val="Normal"/>
+      </w:pPr>
+      <w:r>
+        <w:rPr/>
+        <w:t xml:space="preserve">El wizard de 4 pasos recolecta:</w:t>
+      </w:r>
+    </w:p>
+    <w:p>
+      <w:pPr>
+        <w:pStyle w:val="Normal"/>
+        <w:ind w:left="720"/>
+      </w:pPr>
+      <w:r>
+        <w:rPr/>
+        <w:t xml:space="preserve">• Paso 1 — Perfil básico: edad, estado civil, dependientes, nivel de educación financiera, tipo de ingreso.</w:t>
+      </w:r>
+    </w:p>
+    <w:p>
+      <w:pPr>
+        <w:pStyle w:val="Normal"/>
+        <w:ind w:left="720"/>
+      </w:pPr>
+      <w:r>
+        <w:rPr/>
+        <w:t xml:space="preserve">• Paso 2 — Ingresos, gastos y deudas: ingreso mensual neto, gastos fijos, variables, deuda total, tasa, número de créditos y situación de tarjetas.</w:t>
+      </w:r>
+    </w:p>
+    <w:p>
+      <w:pPr>
+        <w:pStyle w:val="Normal"/>
+        <w:ind w:left="720"/>
+      </w:pPr>
+      <w:r>
+        <w:rPr/>
+        <w:t xml:space="preserve">• Paso 3 — Ahorro, metas e inversión: fondo de emergencia, capital disponible, instrumentos activos, objetivo, horizonte y tendencias.</w:t>
+      </w:r>
+    </w:p>
+    <w:p>
+      <w:pPr>
+        <w:pStyle w:val="Normal"/>
+        <w:ind w:left="720"/>
+      </w:pPr>
+      <w:r>
+        <w:rPr/>
+        <w:t xml:space="preserve">• Paso 4 — Dashboard de resultados: semáforo financiero (verde/amarillo/rojo/gris), tarjetas de métricas clave, lista de recomendaciones con panel '¿Por qué?' por regla y gráfica de proyección a 6 meses.</w:t>
+      </w:r>
+    </w:p>
+    <w:p>
+      <w:pPr>
+        <w:pStyle w:val="Normal"/>
+      </w:pPr>
+      <w:r>
+        <w:rPr/>
+        <w:t xml:space="preserve">La gráfica de proyección usa Chart.js 4.4. Los datos no se almacenan de forma persistente: cada diagnóstico es una sesión stateless.</w:t>
+      </w:r>
+    </w:p>
+    <w:p>
+      <w:pPr>
+        <w:pStyle w:val="Heading 2"/>
+      </w:pPr>
+      <w:r>
+        <w:rPr/>
+        <w:t xml:space="preserve">4. Modo Oscuro / Claro</w:t>
+      </w:r>
+    </w:p>
+    <w:p>
+      <w:pPr>
+        <w:pStyle w:val="Normal"/>
+      </w:pPr>
+      <w:r>
+        <w:rPr/>
+        <w:t xml:space="preserve">Se implementó un toggle de tema claro/oscuro accesible desde la barra de controles (esquina superior derecha de la interfaz). El módulo theme.js persiste la preferencia en localStorage y la aplica antes del primer renderizado para evitar flash de tema incorrecto. El tema oscuro se implementa con variables CSS bajo el selector [data-theme="dark"] en main.css y dashboard.css, sin duplicar clases ni estilos.</w:t>
+      </w:r>
+    </w:p>
+    <w:p>
+      <w:pPr>
+        <w:pStyle w:val="Heading 2"/>
+      </w:pPr>
+      <w:r>
+        <w:rPr/>
+        <w:t xml:space="preserve">5. Internacionalización ES / EN</w:t>
+      </w:r>
+    </w:p>
+    <w:p>
+      <w:pPr>
+        <w:pStyle w:val="Normal"/>
+      </w:pPr>
+      <w:r>
+        <w:rPr/>
+        <w:t xml:space="preserve">La interfaz soporta dos idiomas: español (predeterminado) e inglés. El módulo i18n.js contiene un objeto TRANSLATIONS con aproximadamente 80 claves en cada idioma. La traducción se aplica mediante atributos data-i18n (texto), data-i18n-ph (placeholders) y data-i18n-title (tooltips) en el HTML, sin recargar la página.</w:t>
+      </w:r>
+    </w:p>
+    <w:p>
+      <w:pPr>
+        <w:pStyle w:val="Normal"/>
+      </w:pPr>
+      <w:r>
+        <w:rPr/>
+        <w:t xml:space="preserve">La base de conocimiento y las recomendaciones generadas por el motor permanecen siempre en español, ya que representan el conocimiento experto del dominio. En modo EN se muestra una nota informativa en el dashboard indicando este comportamiento.</w:t>
+      </w:r>
+    </w:p>
+    <w:p>
+      <w:pPr>
+        <w:pStyle w:val="Heading 2"/>
+      </w:pPr>
+      <w:r>
+        <w:rPr/>
+        <w:t xml:space="preserve">6. Validación de Entradas</w:t>
+      </w:r>
+    </w:p>
+    <w:p>
+      <w:pPr>
+        <w:pStyle w:val="Normal"/>
+      </w:pPr>
+      <w:r>
+        <w:rPr/>
+        <w:t xml:space="preserve">La validación opera en dos capas independientes:</w:t>
+      </w:r>
+    </w:p>
+    <w:p>
+      <w:pPr>
+        <w:pStyle w:val="Normal"/>
+      </w:pPr>
+      <w:r>
+        <w:rPr>
+          <w:b/>
+        </w:rPr>
+        <w:t xml:space="preserve">Frontend (wizard.js) — antes de avanzar cada paso:</w:t>
+      </w:r>
+    </w:p>
+    <w:p>
+      <w:pPr>
+        <w:pStyle w:val="Normal"/>
+        <w:ind w:left="720"/>
+      </w:pPr>
+      <w:r>
+        <w:rPr/>
+        <w:t xml:space="preserve">• Paso 1: edad entero entre 18 y 99; dependientes entre 0 y 10.</w:t>
+      </w:r>
+    </w:p>
+    <w:p>
+      <w:pPr>
+        <w:pStyle w:val="Normal"/>
+        <w:ind w:left="720"/>
+      </w:pPr>
+      <w:r>
+        <w:rPr/>
+        <w:t xml:space="preserve">• Paso 2: ingreso mensual mayor a cero; gastos no negativos; tasa de interés entre 0 y 200 %.</w:t>
+      </w:r>
+    </w:p>
+    <w:p>
+      <w:pPr>
+        <w:pStyle w:val="Normal"/>
+        <w:ind w:left="720"/>
+      </w:pPr>
+      <w:r>
+        <w:rPr/>
+        <w:t xml:space="preserve">• Paso 3: horizonte temporal entero entre 1 y 600 meses; fondo de emergencia entre 0 y 36 meses.</w:t>
+      </w:r>
+    </w:p>
+    <w:p>
+      <w:pPr>
+        <w:pStyle w:val="Normal"/>
+      </w:pPr>
+      <w:r>
+        <w:rPr>
+          <w:b/>
+        </w:rPr>
+        <w:t xml:space="preserve">Backend (validators.py llamado desde app.py) — en cada petición a /diagnose y /explain:</w:t>
+      </w:r>
+    </w:p>
+    <w:p>
+      <w:pPr>
+        <w:pStyle w:val="Normal"/>
+        <w:ind w:left="720"/>
+      </w:pPr>
+      <w:r>
+        <w:rPr/>
+        <w:t xml:space="preserve">• Verifica campos requeridos, valores no negativos, edad y tasa en rango válido.</w:t>
+      </w:r>
+    </w:p>
+    <w:p>
+      <w:pPr>
+        <w:pStyle w:val="Normal"/>
+        <w:ind w:left="720"/>
+      </w:pPr>
+      <w:r>
+        <w:rPr/>
+        <w:t xml:space="preserve">• Devuelve HTTP 400 con mensaje descriptivo en español ante cualquier error.</w:t>
+      </w:r>
+    </w:p>
+    <w:p>
+      <w:pPr>
+        <w:pStyle w:val="Normal"/>
+      </w:pPr>
+      <w:r>
+        <w:rPr/>
+        <w:t xml:space="preserve">Los mensajes de error del frontend están disponibles en ES y EN vía el módulo i18n.js.</w:t>
+      </w:r>
+    </w:p>
+    <w:p>
+      <w:pPr>
+        <w:pStyle w:val="Heading 2"/>
+      </w:pPr>
+      <w:r>
+        <w:rPr/>
+        <w:t xml:space="preserve">7. Pruebas Automatizadas</w:t>
+      </w:r>
+    </w:p>
+    <w:p>
+      <w:pPr>
+        <w:pStyle w:val="Normal"/>
+      </w:pPr>
+      <w:r>
+        <w:rPr/>
+        <w:t xml:space="preserve">Se desarrollaron 152 pruebas automatizadas con pytest 8.x, organizadas en dos categorías:</w:t>
+      </w:r>
+    </w:p>
+    <w:p>
+      <w:pPr>
+        <w:pStyle w:val="Normal"/>
+        <w:ind w:left="720"/>
+      </w:pPr>
+      <w:r>
+        <w:rPr/>
+        <w:t xml:space="preserve">• Pruebas unitarias (9 archivos): WorkingMemory, ConflictResolver, Agenda, Explainer, KnowledgeBase, calculators, validators y los 6 dominios de reglas.</w:t>
+      </w:r>
+    </w:p>
+    <w:p>
+      <w:pPr>
+        <w:pStyle w:val="Normal"/>
+        <w:ind w:left="720"/>
+      </w:pPr>
+      <w:r>
+        <w:rPr/>
+        <w:t xml:space="preserve">• Pruebas de integración (6 archivos): escenarios end-to-end (crítico, en riesgo, saludable), componentes del motor, endpoints REST y escenarios de reglas.</w:t>
+      </w:r>
+    </w:p>
+    <w:p>
+      <w:pPr>
+        <w:pStyle w:val="Normal"/>
+      </w:pPr>
+      <w:r>
+        <w:rPr/>
+        <w:t xml:space="preserve">Resultado: 152 passed en 0.33 segundos.</w:t>
+      </w:r>
+    </w:p>
+    <w:p>
+      <w:pPr>
+        <w:pStyle w:val="Heading 2"/>
+      </w:pPr>
+      <w:r>
+        <w:rPr/>
+        <w:t xml:space="preserve">8. Estado General del Sistema</w:t>
+      </w:r>
+    </w:p>
+    <w:p>
+      <w:pPr>
+        <w:pStyle w:val="Normal"/>
+      </w:pPr>
+      <w:r>
+        <w:rPr/>
+        <w:t xml:space="preserve">MARA se encuentra completamente implementado y operativo. La arquitectura stateless permite ejecutar diagnósticos sin base de datos. El sistema arranca con:</w:t>
+      </w:r>
+    </w:p>
+    <w:p>
+      <w:pPr>
+        <w:pStyle w:val="Normal"/>
+        <w:ind w:left="720"/>
+      </w:pPr>
+      <w:r>
+        <w:rPr/>
+        <w:t xml:space="preserve">• cd finexpert/backend &amp;&amp; python app.py   (servidor Flask en http://localhost:5000)</w:t>
+      </w:r>
+    </w:p>
+    <w:p>
+      <w:pPr>
+        <w:pStyle w:val="Normal"/>
+        <w:ind w:left="720"/>
+      </w:pPr>
+      <w:r>
+        <w:rPr/>
+        <w:t xml:space="preserve">• Abrir finexpert/frontend/index.html en el navegador.</w:t>
+      </w:r>
+    </w:p>
+    <w:p>
+      <w:pPr>
+        <w:pStyle w:val="Normal"/>
+      </w:pPr>
+      <w:r>
+        <w:rPr/>
+        <w:t xml:space="preserve">Todos los componentes descritos en la metodología fueron implementados conforme al diseño original, con las siguientes decisiones de implementación adicionales documentadas:</w:t>
+      </w:r>
+    </w:p>
+    <w:p>
+      <w:pPr>
+        <w:pStyle w:val="Normal"/>
+        <w:ind w:left="720"/>
+      </w:pPr>
+      <w:r>
+        <w:rPr/>
+        <w:t xml:space="preserve">• to_initial_facts() aplica max(0, ratio_ahorro) para evitar valores negativos; la regla D01 usa ratio_gasto_fijo &gt; 0.90 como proxy de situación extrema.</w:t>
+      </w:r>
+    </w:p>
+    <w:p>
+      <w:pPr>
+        <w:pStyle w:val="Normal"/>
+        <w:ind w:left="720"/>
+      </w:pPr>
+      <w:r>
+        <w:rPr/>
+        <w:t xml:space="preserve">• La regla PR03 incluye condición explícita perfil_riesgo != muy_conservador para evitar sobreescritura de PR04 (edad ≥ 60).</w:t>
+      </w:r>
+    </w:p>
+    <w:p>
+      <w:pPr>
+        <w:pStyle w:val="Normal"/>
+        <w:ind w:left="720"/>
+      </w:pPr>
+      <w:r>
+        <w:rPr/>
+        <w:t xml:space="preserve">• Los colores de la gráfica Chart.js se adaptan al tema activo en el momento del diagnóstico.</w:t>
       </w:r>
     </w:p>
     <w:p>

</xml_diff>